<commit_message>
Add CTU thesis template and build scripts
- Introduced main LaTeX file (main.tex) for the CTU thesis template.
- Created build script (build.py) to automate the compilation process with support for bibliography management.
- Added validation script (check_template.py) to ensure all required resources are present and correctly linked.
- Implemented a doctor script (doctor.py) to check for necessary tools and font availability.
- Developed bibliography management with support for both BibTeX and BibLaTeX.
- Established custom commands and configurations in commands.tex for consistent formatting.
- Defined document class (ctu-thesis.cls) with specific layout and styling requirements.
- Included necessary packages in packages.tex for graphics, tables, and typography.
- Configured typography settings in typography.tex to use Times New Roman and set spacing.
- Added logo file (logo-ctu.png) for branding in the thesis.
</commit_message>
<xml_diff>
--- a/topics/degron-footprint/proposal/proposal.docx
+++ b/topics/degron-footprint/proposal/proposal.docx
@@ -194,42 +194,63 @@
         <w:t xml:space="preserve">[Bổ sung nếu có] — MSCB: [Bổ sung nếu có]</w:t>
       </w:r>
     </w:p>
+    <w:bookmarkStart w:id="23" w:name="i.-mở-đầu"/>
+    <w:p>
+      <w:pPr>
+        <w:pStyle w:val="Heading1"/>
+      </w:pPr>
+      <w:r>
+        <w:t xml:space="preserve">I. MỞ ĐẦU</w:t>
+      </w:r>
+    </w:p>
+    <w:bookmarkStart w:id="20" w:name="lý-do-chọn-đề-tài"/>
+    <w:p>
+      <w:pPr>
+        <w:pStyle w:val="Heading2"/>
+      </w:pPr>
+      <w:r>
+        <w:t xml:space="preserve">1. Lý do chọn đề tài</w:t>
+      </w:r>
+    </w:p>
+    <w:p>
+      <w:pPr>
+        <w:pStyle w:val="FirstParagraph"/>
+      </w:pPr>
+      <w:r>
+        <w:t xml:space="preserve">Lượng protein trong tế bào chịu ảnh hưởng của cả quá trình tổng hợp và phân hủy. Trong hệ ubiquitin–proteasome, degron là tín hiệu liên quan đến việc nhận diện protein để phân hủy. Một thay đổi amino acid tại degron có thể làm thay đổi hoạt tính tín hiệu này. Vì vậy, xác định ảnh hưởng của từng phép thay thế có ý nghĩa đối với việc lựa chọn đột biến để kiểm chứng chức năng protein [</w:t>
+      </w:r>
+      <w:hyperlink w:anchor="ref-1">
+        <w:r>
+          <w:rPr>
+            <w:rStyle w:val="Hyperlink"/>
+          </w:rPr>
+          <w:t xml:space="preserve">1</w:t>
+        </w:r>
+      </w:hyperlink>
+      <w:r>
+        <w:t xml:space="preserve">,</w:t>
+      </w:r>
+      <w:r>
+        <w:t xml:space="preserve"> </w:t>
+      </w:r>
+      <w:hyperlink w:anchor="ref-2">
+        <w:r>
+          <w:rPr>
+            <w:rStyle w:val="Hyperlink"/>
+          </w:rPr>
+          <w:t xml:space="preserve">2</w:t>
+        </w:r>
+      </w:hyperlink>
+      <w:r>
+        <w:t xml:space="preserve">].</w:t>
+      </w:r>
+    </w:p>
     <w:p>
       <w:pPr>
         <w:pStyle w:val="BodyText"/>
       </w:pPr>
       <w:r>
-        <w:rPr>
-          <w:iCs/>
-          <w:i/>
-        </w:rPr>
-        <w:t xml:space="preserve">Bản dự thảo ngày 21/10/2026. Tên đề tài và phương án nghiên cứu chờ thống nhất với giảng viên hướng dẫn.</w:t>
-      </w:r>
-    </w:p>
-    <w:bookmarkStart w:id="23" w:name="i.-mở-đầu"/>
-    <w:p>
-      <w:pPr>
-        <w:pStyle w:val="Heading1"/>
-      </w:pPr>
-      <w:r>
-        <w:t xml:space="preserve">I. MỞ ĐẦU</w:t>
-      </w:r>
-    </w:p>
-    <w:bookmarkStart w:id="20" w:name="lý-do-chọn-đề-tài"/>
-    <w:p>
-      <w:pPr>
-        <w:pStyle w:val="Heading2"/>
-      </w:pPr>
-      <w:r>
-        <w:t xml:space="preserve">1. Lý do chọn đề tài</w:t>
-      </w:r>
-    </w:p>
-    <w:p>
-      <w:pPr>
-        <w:pStyle w:val="FirstParagraph"/>
-      </w:pPr>
-      <w:r>
-        <w:t xml:space="preserve">Lượng protein trong tế bào chịu ảnh hưởng của cả quá trình tổng hợp và phân hủy. Trong hệ ubiquitin–proteasome, degron là tín hiệu liên quan đến việc nhận diện protein để phân hủy. Một thay đổi amino acid tại degron có thể làm thay đổi hoạt tính tín hiệu này. Vì vậy, xác định ảnh hưởng của từng phép thay thế có ý nghĩa đối với việc lựa chọn đột biến để kiểm chứng chức năng protein [1, 2].</w:t>
+        <w:t xml:space="preserve">Điểm hoạt tính của cả đoạn peptide chưa trực tiếp trả lời câu hỏi: thay amino acid nào, tại vị trí nào, sẽ làm tín hiệu degron mạnh lên hay yếu đi? Đo toàn bộ các phép thay thế bằng thực nghiệm cần nhiều nguồn lực. Mô hình dự đoán có thể hỗ trợ thu hẹp danh sách đột biến ưu tiên, với điều kiện được đánh giá trên nhãn phù hợp và kiểm soát sự tương đồng giữa dữ liệu huấn luyện và kiểm tra.</w:t>
       </w:r>
     </w:p>
     <w:p>
@@ -237,7 +258,43 @@
         <w:pStyle w:val="BodyText"/>
       </w:pPr>
       <w:r>
-        <w:t xml:space="preserve">Điểm hoạt tính của cả đoạn peptide chưa trực tiếp trả lời câu hỏi: thay amino acid nào, tại vị trí nào, sẽ làm tín hiệu degron mạnh lên hay yếu đi? Đo toàn bộ các phép thay thế bằng thực nghiệm cần nhiều nguồn lực. Mô hình dự đoán có thể hỗ trợ thu hẹp danh sách đột biến ưu tiên, với điều kiện được đánh giá trên nhãn phù hợp và kiểm soát sự tương đồng giữa dữ liệu huấn luyện và kiểm tra.</w:t>
+        <w:t xml:space="preserve">Zhang và cộng sự cung cấp dữ liệu đột biến quét và bão hòa làm cơ sở xây dựng nhãn thực nghiệm [</w:t>
+      </w:r>
+      <w:hyperlink w:anchor="ref-1">
+        <w:r>
+          <w:rPr>
+            <w:rStyle w:val="Hyperlink"/>
+          </w:rPr>
+          <w:t xml:space="preserve">1</w:t>
+        </w:r>
+      </w:hyperlink>
+      <w:r>
+        <w:t xml:space="preserve">]. PAP và Degformer cung cấp các phương pháp đối chứng; trong đó Degformer đã hỗ trợ mô phỏng đột biến và xuất ma trận vị trí × amino acid [</w:t>
+      </w:r>
+      <w:hyperlink w:anchor="ref-2">
+        <w:r>
+          <w:rPr>
+            <w:rStyle w:val="Hyperlink"/>
+          </w:rPr>
+          <w:t xml:space="preserve">2</w:t>
+        </w:r>
+      </w:hyperlink>
+      <w:r>
+        <w:t xml:space="preserve">,</w:t>
+      </w:r>
+      <w:r>
+        <w:t xml:space="preserve"> </w:t>
+      </w:r>
+      <w:hyperlink w:anchor="ref-3">
+        <w:r>
+          <w:rPr>
+            <w:rStyle w:val="Hyperlink"/>
+          </w:rPr>
+          <w:t xml:space="preserve">3</w:t>
+        </w:r>
+      </w:hyperlink>
+      <w:r>
+        <w:t xml:space="preserve">]. Do đó, đóng góp cần được kiểm chứng bằng hiệu quả dự đoán, độ ổn định và thiết kế đánh giá, thay vì chỉ dựa vào việc tạo ma trận hoặc xây dựng giao diện mới.</w:t>
       </w:r>
     </w:p>
     <w:p>
@@ -245,15 +302,18 @@
         <w:pStyle w:val="BodyText"/>
       </w:pPr>
       <w:r>
-        <w:t xml:space="preserve">Zhang và cộng sự cung cấp dữ liệu đột biến quét và bão hòa làm cơ sở xây dựng nhãn thực nghiệm [1]. PAP và Degformer cung cấp các phương pháp đối chứng; trong đó Degformer đã hỗ trợ mô phỏng đột biến và xuất ma trận vị trí × amino acid [2, 3]. Do đó, đóng góp cần được kiểm chứng bằng hiệu quả dự đoán, độ ổn định và thiết kế đánh giá, thay vì chỉ dựa vào việc tạo ma trận hoặc xây dựng giao diện mới.</w:t>
-      </w:r>
-    </w:p>
-    <w:p>
-      <w:pPr>
-        <w:pStyle w:val="BodyText"/>
-      </w:pPr>
-      <w:r>
-        <w:t xml:space="preserve">Khảo sát thực nghiệm nội bộ bước đầu cho thấy mô hình ridge có thể vượt đối chứng chênh lệch điểm PAP trên bộ bão hòa, nhưng chưa xác lập được lợi ích ổn định của các thành phần kiến trúc phức tạp hơn [8]. Đề tài tiếp tục nghiên cứu vai trò của lượng nhãn, biểu diễn trình tự và học chuyển tiếp; đồng thời xây dựng công cụ giúp truy xuất kết quả cùng nguồn gốc và giới hạn áp dụng.</w:t>
+        <w:t xml:space="preserve">Khảo sát thực nghiệm nội bộ bước đầu cho thấy mô hình ridge có thể vượt đối chứng chênh lệch điểm PAP trên bộ bão hòa, nhưng chưa xác lập được lợi ích ổn định của các thành phần kiến trúc phức tạp hơn [</w:t>
+      </w:r>
+      <w:hyperlink w:anchor="ref-8">
+        <w:r>
+          <w:rPr>
+            <w:rStyle w:val="Hyperlink"/>
+          </w:rPr>
+          <w:t xml:space="preserve">8</w:t>
+        </w:r>
+      </w:hyperlink>
+      <w:r>
+        <w:t xml:space="preserve">]. Đề tài tiếp tục nghiên cứu vai trò của lượng nhãn, biểu diễn trình tự và học chuyển tiếp; đồng thời xây dựng công cụ giúp truy xuất kết quả cùng nguồn gốc và giới hạn áp dụng.</w:t>
       </w:r>
     </w:p>
     <w:bookmarkEnd w:id="20"/>
@@ -405,7 +465,18 @@
         <w:pStyle w:val="Compact"/>
       </w:pPr>
       <w:r>
-        <w:t xml:space="preserve">Nguồn nhãn chính là dữ liệu peptide người của Zhang 2023, gồm đột biến quét và bão hòa. Bộ bão hòa sau lọc hiện có 91 peptide, 89 cụm protein và 47.847 ô phép thay thế [8]. Đây là số mẫu sau xử lý của đề tài.</w:t>
+        <w:t xml:space="preserve">Nguồn nhãn chính là dữ liệu peptide người của Zhang 2023, gồm đột biến quét và bão hòa. Bộ bão hòa sau lọc hiện có 91 peptide, 89 cụm protein và 47.847 ô phép thay thế [</w:t>
+      </w:r>
+      <w:hyperlink w:anchor="ref-8">
+        <w:r>
+          <w:rPr>
+            <w:rStyle w:val="Hyperlink"/>
+          </w:rPr>
+          <w:t xml:space="preserve">8</w:t>
+        </w:r>
+      </w:hyperlink>
+      <w:r>
+        <w:t xml:space="preserve">]. Đây là số mẫu sau xử lý của đề tài.</w:t>
       </w:r>
     </w:p>
     <w:p>
@@ -429,7 +500,32 @@
         <w:pStyle w:val="Compact"/>
       </w:pPr>
       <w:r>
-        <w:t xml:space="preserve">Dữ liệu mức peptide của Voutsinos được xem xét cho học chuyển tiếp. Larsen chỉ phục vụ khảo sát chuyển miền ở mức tile khi điều kiện sử dụng được xác nhận; không được thay cho nhãn đột biến thực nghiệm [2, 4].</w:t>
+        <w:t xml:space="preserve">Dữ liệu mức peptide của Voutsinos được xem xét cho học chuyển tiếp. Larsen chỉ phục vụ khảo sát chuyển miền ở mức tile khi điều kiện sử dụng được xác nhận; không được thay cho nhãn đột biến thực nghiệm [</w:t>
+      </w:r>
+      <w:hyperlink w:anchor="ref-2">
+        <w:r>
+          <w:rPr>
+            <w:rStyle w:val="Hyperlink"/>
+          </w:rPr>
+          <w:t xml:space="preserve">2</w:t>
+        </w:r>
+      </w:hyperlink>
+      <w:r>
+        <w:t xml:space="preserve">,</w:t>
+      </w:r>
+      <w:r>
+        <w:t xml:space="preserve"> </w:t>
+      </w:r>
+      <w:hyperlink w:anchor="ref-4">
+        <w:r>
+          <w:rPr>
+            <w:rStyle w:val="Hyperlink"/>
+          </w:rPr>
+          <w:t xml:space="preserve">4</w:t>
+        </w:r>
+      </w:hyperlink>
+      <w:r>
+        <w:t xml:space="preserve">].</w:t>
       </w:r>
     </w:p>
     <w:p>
@@ -527,7 +623,40 @@
         <w:t xml:space="preserve"> </w:t>
       </w:r>
       <w:r>
-        <w:t xml:space="preserve">Zhang và cộng sự [1]; Voutsinos và cộng sự [2]; Larsen và cộng sự [4].</w:t>
+        <w:t xml:space="preserve">Zhang và cộng sự [</w:t>
+      </w:r>
+      <w:hyperlink w:anchor="ref-1">
+        <w:r>
+          <w:rPr>
+            <w:rStyle w:val="Hyperlink"/>
+          </w:rPr>
+          <w:t xml:space="preserve">1</w:t>
+        </w:r>
+      </w:hyperlink>
+      <w:r>
+        <w:t xml:space="preserve">]; Voutsinos và cộng sự [</w:t>
+      </w:r>
+      <w:hyperlink w:anchor="ref-2">
+        <w:r>
+          <w:rPr>
+            <w:rStyle w:val="Hyperlink"/>
+          </w:rPr>
+          <w:t xml:space="preserve">2</w:t>
+        </w:r>
+      </w:hyperlink>
+      <w:r>
+        <w:t xml:space="preserve">]; Larsen và cộng sự [</w:t>
+      </w:r>
+      <w:hyperlink w:anchor="ref-4">
+        <w:r>
+          <w:rPr>
+            <w:rStyle w:val="Hyperlink"/>
+          </w:rPr>
+          <w:t xml:space="preserve">4</w:t>
+        </w:r>
+      </w:hyperlink>
+      <w:r>
+        <w:t xml:space="preserve">].</w:t>
       </w:r>
     </w:p>
     <w:bookmarkEnd w:id="24"/>
@@ -625,7 +754,18 @@
         <w:t xml:space="preserve"> </w:t>
       </w:r>
       <w:r>
-        <w:t xml:space="preserve">số đọc, khác biệt replicate và điều kiện đo. Pipeline phải mô tả cách tạo mốc WT, gộp replicate và xử lý giá trị thiếu. Mốc WT của bộ bão hòa lấy từ các ô đồng nghĩa trong cùng hệ đo; không lấy điều kiện BAG6 WT thay thế [8].</w:t>
+        <w:t xml:space="preserve">số đọc, khác biệt replicate và điều kiện đo. Pipeline phải mô tả cách tạo mốc WT, gộp replicate và xử lý giá trị thiếu. Mốc WT của bộ bão hòa lấy từ các ô đồng nghĩa trong cùng hệ đo; không lấy điều kiện BAG6 WT thay thế [</w:t>
+      </w:r>
+      <w:hyperlink w:anchor="ref-8">
+        <w:r>
+          <w:rPr>
+            <w:rStyle w:val="Hyperlink"/>
+          </w:rPr>
+          <w:t xml:space="preserve">8</w:t>
+        </w:r>
+      </w:hyperlink>
+      <w:r>
+        <w:t xml:space="preserve">].</w:t>
       </w:r>
     </w:p>
     <w:p>
@@ -647,7 +787,29 @@
         <w:t xml:space="preserve"> </w:t>
       </w:r>
       <w:r>
-        <w:t xml:space="preserve">Zhang và cộng sự [1], bộ dữ liệu Mendeley phiên bản 2 [6].</w:t>
+        <w:t xml:space="preserve">Zhang và cộng sự [</w:t>
+      </w:r>
+      <w:hyperlink w:anchor="ref-1">
+        <w:r>
+          <w:rPr>
+            <w:rStyle w:val="Hyperlink"/>
+          </w:rPr>
+          <w:t xml:space="preserve">1</w:t>
+        </w:r>
+      </w:hyperlink>
+      <w:r>
+        <w:t xml:space="preserve">], bộ dữ liệu Mendeley phiên bản 2 [</w:t>
+      </w:r>
+      <w:hyperlink w:anchor="ref-6">
+        <w:r>
+          <w:rPr>
+            <w:rStyle w:val="Hyperlink"/>
+          </w:rPr>
+          <w:t xml:space="preserve">6</w:t>
+        </w:r>
+      </w:hyperlink>
+      <w:r>
+        <w:t xml:space="preserve">].</w:t>
       </w:r>
     </w:p>
     <w:bookmarkEnd w:id="25"/>
@@ -701,7 +863,32 @@
         <w:t xml:space="preserve"> </w:t>
       </w:r>
       <w:r>
-        <w:t xml:space="preserve">hồi quy ridge làm đối chứng đơn giản; PAP dự đoán điểm cả peptide, từ đó tính ΔPAP = PAP(mutant) − PAP(WT); Degformer dùng transformer dự đoán PSI [2, 3]. Chiều điểm khi đánh giá phải thống nhất với nhãn đích.</w:t>
+        <w:t xml:space="preserve">hồi quy ridge làm đối chứng đơn giản; PAP dự đoán điểm cả peptide, từ đó tính ΔPAP = PAP(mutant) − PAP(WT); Degformer dùng transformer dự đoán PSI [</w:t>
+      </w:r>
+      <w:hyperlink w:anchor="ref-2">
+        <w:r>
+          <w:rPr>
+            <w:rStyle w:val="Hyperlink"/>
+          </w:rPr>
+          <w:t xml:space="preserve">2</w:t>
+        </w:r>
+      </w:hyperlink>
+      <w:r>
+        <w:t xml:space="preserve">,</w:t>
+      </w:r>
+      <w:r>
+        <w:t xml:space="preserve"> </w:t>
+      </w:r>
+      <w:hyperlink w:anchor="ref-3">
+        <w:r>
+          <w:rPr>
+            <w:rStyle w:val="Hyperlink"/>
+          </w:rPr>
+          <w:t xml:space="preserve">3</w:t>
+        </w:r>
+      </w:hyperlink>
+      <w:r>
+        <w:t xml:space="preserve">]. Chiều điểm khi đánh giá phải thống nhất với nhãn đích.</w:t>
       </w:r>
     </w:p>
     <w:p>
@@ -767,7 +954,40 @@
         <w:t xml:space="preserve"> </w:t>
       </w:r>
       <w:r>
-        <w:t xml:space="preserve">PAP [2], Degformer [3], MetaDegron [5] để đối chiếu phạm vi dự đoán.</w:t>
+        <w:t xml:space="preserve">PAP [</w:t>
+      </w:r>
+      <w:hyperlink w:anchor="ref-2">
+        <w:r>
+          <w:rPr>
+            <w:rStyle w:val="Hyperlink"/>
+          </w:rPr>
+          <w:t xml:space="preserve">2</w:t>
+        </w:r>
+      </w:hyperlink>
+      <w:r>
+        <w:t xml:space="preserve">], Degformer [</w:t>
+      </w:r>
+      <w:hyperlink w:anchor="ref-3">
+        <w:r>
+          <w:rPr>
+            <w:rStyle w:val="Hyperlink"/>
+          </w:rPr>
+          <w:t xml:space="preserve">3</w:t>
+        </w:r>
+      </w:hyperlink>
+      <w:r>
+        <w:t xml:space="preserve">], MetaDegron [</w:t>
+      </w:r>
+      <w:hyperlink w:anchor="ref-5">
+        <w:r>
+          <w:rPr>
+            <w:rStyle w:val="Hyperlink"/>
+          </w:rPr>
+          <w:t xml:space="preserve">5</w:t>
+        </w:r>
+      </w:hyperlink>
+      <w:r>
+        <w:t xml:space="preserve">] để đối chiếu phạm vi dự đoán.</w:t>
       </w:r>
     </w:p>
     <w:bookmarkEnd w:id="26"/>
@@ -877,7 +1097,29 @@
         <w:pStyle w:val="BodyText"/>
       </w:pPr>
       <w:r>
-        <w:t xml:space="preserve">Bằng chứng phát triển hiện có ghi nhận AUROC macro 0,8082 của ridge và 0,7693 của ΔPAP trên cùng bộ bão hòa [8]. Kết quả này chưa chứng minh tính mới kiến trúc. Các thử nghiệm tương tác và huấn luyện lại kiến trúc Degformer với ngân sách nhãn nhỏ cũng chưa cho lợi ích so với ridge [9]. Dữ liệu này định hướng giả thuyết tiếp theo, không thay thế một phép kiểm chứng xác nhận cuối cùng.</w:t>
+        <w:t xml:space="preserve">Bằng chứng phát triển hiện có ghi nhận AUROC macro 0,8082 của ridge và 0,7693 của ΔPAP trên cùng bộ bão hòa [</w:t>
+      </w:r>
+      <w:hyperlink w:anchor="ref-8">
+        <w:r>
+          <w:rPr>
+            <w:rStyle w:val="Hyperlink"/>
+          </w:rPr>
+          <w:t xml:space="preserve">8</w:t>
+        </w:r>
+      </w:hyperlink>
+      <w:r>
+        <w:t xml:space="preserve">]. Kết quả này chưa chứng minh tính mới kiến trúc. Các thử nghiệm tương tác và huấn luyện lại kiến trúc Degformer với ngân sách nhãn nhỏ cũng chưa cho lợi ích so với ridge [</w:t>
+      </w:r>
+      <w:hyperlink w:anchor="ref-9">
+        <w:r>
+          <w:rPr>
+            <w:rStyle w:val="Hyperlink"/>
+          </w:rPr>
+          <w:t xml:space="preserve">9</w:t>
+        </w:r>
+      </w:hyperlink>
+      <w:r>
+        <w:t xml:space="preserve">]. Dữ liệu này định hướng giả thuyết tiếp theo, không thay thế một phép kiểm chứng xác nhận cuối cùng.</w:t>
       </w:r>
     </w:p>
     <w:p>
@@ -1555,7 +1797,18 @@
         <w:pStyle w:val="BodyText"/>
       </w:pPr>
       <w:r>
-        <w:t xml:space="preserve">Mỗi nguồn được ghim phiên bản hoặc ngày tải, checksum và điều kiện sử dụng. Nhãn khác assay được giữ riêng. MetaDegron chỉ dùng khảo sát/truy nguồn trong phạm vi hiện tại; việc nhập nhãn vào huấn luyện hoặc công khai còn phụ thuộc quyền sử dụng và thẩm định nguồn [10].</w:t>
+        <w:t xml:space="preserve">Mỗi nguồn được ghim phiên bản hoặc ngày tải, checksum và điều kiện sử dụng. Nhãn khác assay được giữ riêng. MetaDegron chỉ dùng khảo sát/truy nguồn trong phạm vi hiện tại; việc nhập nhãn vào huấn luyện hoặc công khai còn phụ thuộc quyền sử dụng và thẩm định nguồn [</w:t>
+      </w:r>
+      <w:hyperlink w:anchor="ref-10">
+        <w:r>
+          <w:rPr>
+            <w:rStyle w:val="Hyperlink"/>
+          </w:rPr>
+          <w:t xml:space="preserve">10</w:t>
+        </w:r>
+      </w:hyperlink>
+      <w:r>
+        <w:t xml:space="preserve">].</w:t>
       </w:r>
     </w:p>
     <w:bookmarkEnd w:id="40"/>
@@ -1967,7 +2220,7 @@
       </w:r>
     </w:p>
     <w:bookmarkEnd w:id="47"/>
-    <w:bookmarkStart w:id="53" w:name="vii.-tài-liệu-tham-khảo"/>
+    <w:bookmarkStart w:id="63" w:name="vii.-tài-liệu-tham-khảo"/>
     <w:p>
       <w:pPr>
         <w:pStyle w:val="Heading1"/>
@@ -1997,7 +2250,29 @@
         <w:t xml:space="preserve"> </w:t>
       </w:r>
       <w:r>
-        <w:t xml:space="preserve">theo yêu cầu của mẫu. Danh mục dưới đây là danh mục khởi đầu; các báo cáo nội bộ [8–10] dùng để truy xuất bằng chứng tiền đề, không thay thế công trình khoa học đã công bố.</w:t>
+        <w:t xml:space="preserve">theo yêu cầu của mẫu. Danh mục dưới đây là danh mục khởi đầu; các báo cáo nội bộ [</w:t>
+      </w:r>
+      <w:hyperlink w:anchor="ref-8">
+        <w:r>
+          <w:rPr>
+            <w:rStyle w:val="Hyperlink"/>
+          </w:rPr>
+          <w:t xml:space="preserve">8</w:t>
+        </w:r>
+      </w:hyperlink>
+      <w:r>
+        <w:t xml:space="preserve">–</w:t>
+      </w:r>
+      <w:hyperlink w:anchor="ref-10">
+        <w:r>
+          <w:rPr>
+            <w:rStyle w:val="Hyperlink"/>
+          </w:rPr>
+          <w:t xml:space="preserve">10</w:t>
+        </w:r>
+      </w:hyperlink>
+      <w:r>
+        <w:t xml:space="preserve">] dùng để truy xuất bằng chứng tiền đề, không thay thế công trình khoa học đã công bố.</w:t>
       </w:r>
     </w:p>
     <w:p>
@@ -2008,6 +2283,8 @@
         </w:numPr>
         <w:pStyle w:val="Compact"/>
       </w:pPr>
+      <w:bookmarkStart w:id="48" w:name="ref-1"/>
+      <w:bookmarkEnd w:id="48"/>
       <w:r>
         <w:t xml:space="preserve">Zhang, Z. và cộng sự (2023).</w:t>
       </w:r>
@@ -2027,7 +2304,7 @@
       <w:r>
         <w:t xml:space="preserve"> </w:t>
       </w:r>
-      <w:hyperlink r:id="rId48">
+      <w:hyperlink r:id="rId49">
         <w:r>
           <w:rPr>
             <w:rStyle w:val="Hyperlink"/>
@@ -2047,6 +2324,8 @@
         </w:numPr>
         <w:pStyle w:val="Compact"/>
       </w:pPr>
+      <w:bookmarkStart w:id="50" w:name="ref-2"/>
+      <w:bookmarkEnd w:id="50"/>
       <w:r>
         <w:t xml:space="preserve">Voutsinos, V. và cộng sự (2026).</w:t>
       </w:r>
@@ -2066,7 +2345,7 @@
       <w:r>
         <w:t xml:space="preserve"> </w:t>
       </w:r>
-      <w:hyperlink r:id="rId49">
+      <w:hyperlink r:id="rId51">
         <w:r>
           <w:rPr>
             <w:rStyle w:val="Hyperlink"/>
@@ -2086,6 +2365,8 @@
         </w:numPr>
         <w:pStyle w:val="Compact"/>
       </w:pPr>
+      <w:bookmarkStart w:id="52" w:name="ref-3"/>
+      <w:bookmarkEnd w:id="52"/>
       <w:r>
         <w:t xml:space="preserve">Alpine2048.</w:t>
       </w:r>
@@ -2105,7 +2386,7 @@
       <w:r>
         <w:t xml:space="preserve"> </w:t>
       </w:r>
-      <w:hyperlink r:id="rId50">
+      <w:hyperlink r:id="rId53">
         <w:r>
           <w:rPr>
             <w:rStyle w:val="Hyperlink"/>
@@ -2125,6 +2406,8 @@
         </w:numPr>
         <w:pStyle w:val="Compact"/>
       </w:pPr>
+      <w:bookmarkStart w:id="54" w:name="ref-4"/>
+      <w:bookmarkEnd w:id="54"/>
       <w:r>
         <w:t xml:space="preserve">Larsen, F. B. và cộng sự (2025).</w:t>
       </w:r>
@@ -2144,7 +2427,7 @@
       <w:r>
         <w:t xml:space="preserve"> </w:t>
       </w:r>
-      <w:hyperlink r:id="rId51">
+      <w:hyperlink r:id="rId55">
         <w:r>
           <w:rPr>
             <w:rStyle w:val="Hyperlink"/>
@@ -2164,6 +2447,8 @@
         </w:numPr>
         <w:pStyle w:val="Compact"/>
       </w:pPr>
+      <w:bookmarkStart w:id="56" w:name="ref-5"/>
+      <w:bookmarkEnd w:id="56"/>
       <w:r>
         <w:t xml:space="preserve">Zheng, M. và cộng sự (2024).</w:t>
       </w:r>
@@ -2203,6 +2488,8 @@
         </w:numPr>
         <w:pStyle w:val="Compact"/>
       </w:pPr>
+      <w:bookmarkStart w:id="57" w:name="ref-6"/>
+      <w:bookmarkEnd w:id="57"/>
       <w:r>
         <w:t xml:space="preserve">Zhang và cộng sự (2023). Bộ dữ liệu đi kèm nghiên cứu degron,</w:t>
       </w:r>
@@ -2222,7 +2509,7 @@
       <w:r>
         <w:t xml:space="preserve"> </w:t>
       </w:r>
-      <w:hyperlink r:id="rId52">
+      <w:hyperlink r:id="rId58">
         <w:r>
           <w:rPr>
             <w:rStyle w:val="Hyperlink"/>
@@ -2242,6 +2529,8 @@
         </w:numPr>
         <w:pStyle w:val="Compact"/>
       </w:pPr>
+      <w:bookmarkStart w:id="59" w:name="ref-7"/>
+      <w:bookmarkEnd w:id="59"/>
       <w:r>
         <w:t xml:space="preserve">NCBI.</w:t>
       </w:r>
@@ -2281,6 +2570,8 @@
         </w:numPr>
         <w:pStyle w:val="Compact"/>
       </w:pPr>
+      <w:bookmarkStart w:id="60" w:name="ref-8"/>
+      <w:bookmarkEnd w:id="60"/>
       <w:r>
         <w:t xml:space="preserve">Nguyễn Thanh Trọng (18/10/2026).</w:t>
       </w:r>
@@ -2330,6 +2621,8 @@
         </w:numPr>
         <w:pStyle w:val="Compact"/>
       </w:pPr>
+      <w:bookmarkStart w:id="61" w:name="ref-9"/>
+      <w:bookmarkEnd w:id="61"/>
       <w:r>
         <w:t xml:space="preserve">Nguyễn Thanh Trọng (18/10/2026).</w:t>
       </w:r>
@@ -2367,6 +2660,8 @@
         </w:numPr>
         <w:pStyle w:val="Compact"/>
       </w:pPr>
+      <w:bookmarkStart w:id="62" w:name="ref-10"/>
+      <w:bookmarkEnd w:id="62"/>
       <w:r>
         <w:t xml:space="preserve">Nguyễn Thanh Trọng (21/10/2026).</w:t>
       </w:r>
@@ -2396,7 +2691,7 @@
         <w:t xml:space="preserve">; phần đề xuất chưa phải quyết định thực hiện.</w:t>
       </w:r>
     </w:p>
-    <w:bookmarkEnd w:id="53"/>
+    <w:bookmarkEnd w:id="63"/>
     <w:sectPr>
       <w:pgSz w:h="15840" w:w="12240"/>
       <w:pgMar w:bottom="1440" w:footer="720" w:gutter="0" w:header="720" w:left="1440" w:right="1440" w:top="1440"/>

</xml_diff>

<commit_message>
Revise proposal with P0-P6 results, Koren gate and negative findings
Co-Authored-By: Claude Sonnet 5.5 <noreply@anthropic.com>
</commit_message>
<xml_diff>
--- a/topics/degron-footprint/proposal/proposal.docx
+++ b/topics/degron-footprint/proposal/proposal.docx
@@ -176,22 +176,6 @@
       </w:r>
       <w:r>
         <w:t xml:space="preserve">TS. Hồ Quang Thái — MSCB: [Bổ sung]</w:t>
-      </w:r>
-      <w:r>
-        <w:br/>
-      </w:r>
-      <w:r>
-        <w:rPr>
-          <w:bCs/>
-          <w:b/>
-        </w:rPr>
-        <w:t xml:space="preserve">Giáo viên hướng dẫn 2:</w:t>
-      </w:r>
-      <w:r>
-        <w:t xml:space="preserve"> </w:t>
-      </w:r>
-      <w:r>
-        <w:t xml:space="preserve">[Bổ sung nếu có] — MSCB: [Bổ sung nếu có]</w:t>
       </w:r>
     </w:p>
     <w:bookmarkStart w:id="23" w:name="i.-mở-đầu"/>
@@ -313,7 +297,32 @@
         </w:r>
       </w:hyperlink>
       <w:r>
-        <w:t xml:space="preserve">]. Đề tài tiếp tục nghiên cứu vai trò của lượng nhãn, biểu diễn trình tự và học chuyển tiếp; đồng thời xây dựng công cụ giúp truy xuất kết quả cùng nguồn gốc và giới hạn áp dụng.</w:t>
+        <w:t xml:space="preserve">]. Các khảo sát tiếp theo (22/10/2026) cho thấy phân bố của nhãn huấn luyện, chứ không riêng số lượng nhãn, là yếu tố đáng chú ý hơn, và tiền huấn luyện trên nhãn mức peptide theo thiết kế đã thử chưa đem lại lợi ích [</w:t>
+      </w:r>
+      <w:hyperlink w:anchor="ref-11">
+        <w:r>
+          <w:rPr>
+            <w:rStyle w:val="Hyperlink"/>
+          </w:rPr>
+          <w:t xml:space="preserve">11</w:t>
+        </w:r>
+      </w:hyperlink>
+      <w:r>
+        <w:t xml:space="preserve">,</w:t>
+      </w:r>
+      <w:r>
+        <w:t xml:space="preserve"> </w:t>
+      </w:r>
+      <w:hyperlink w:anchor="ref-12">
+        <w:r>
+          <w:rPr>
+            <w:rStyle w:val="Hyperlink"/>
+          </w:rPr>
+          <w:t xml:space="preserve">12</w:t>
+        </w:r>
+      </w:hyperlink>
+      <w:r>
+        <w:t xml:space="preserve">]. Đề tài tiếp tục nghiên cứu vai trò của nguồn nhãn, biểu diễn trình tự và học chuyển tiếp; đồng thời xây dựng công cụ giúp truy xuất kết quả cùng nguồn gốc và giới hạn áp dụng.</w:t>
       </w:r>
     </w:p>
     <w:bookmarkEnd w:id="20"/>
@@ -389,7 +398,7 @@
         <w:pStyle w:val="Compact"/>
       </w:pPr>
       <w:r>
-        <w:t xml:space="preserve">Kiểm tra giả thuyết học biểu diễn từ nhãn mức peptide rồi tinh chỉnh trên nhãn đột biến có cải thiện dự đoán so với học trực tiếp hay không; khảo sát đường cong học trước khi lựa chọn mô hình.</w:t>
+        <w:t xml:space="preserve">Kiểm tra giả thuyết học biểu diễn từ nhãn mức peptide rồi tinh chỉnh trên nhãn đột biến có cải thiện dự đoán so với học trực tiếp hay không (một thiết kế đã thử, chưa có lợi ích; xem III.1); khảo sát đường cong học và vai trò của phân bố nhãn huấn luyện trước khi lựa chọn mô hình (đã thực hiện).</w:t>
       </w:r>
     </w:p>
     <w:p>
@@ -465,7 +474,7 @@
         <w:pStyle w:val="Compact"/>
       </w:pPr>
       <w:r>
-        <w:t xml:space="preserve">Nguồn nhãn chính là dữ liệu peptide người của Zhang 2023, gồm đột biến quét và bão hòa. Bộ bão hòa sau lọc hiện có 91 peptide, 89 cụm protein và 47.847 ô phép thay thế [</w:t>
+        <w:t xml:space="preserve">Nguồn nhãn chính là dữ liệu peptide người của Zhang 2023, gồm đột biến quét và bão hòa. Miền đánh giá là bộ bão hòa sau lọc gồm 91 peptide, 89 cụm protein và 47.847 ô phép thay thế (ngưỡng PSI(WT) ≤ 3,0) [</w:t>
       </w:r>
       <w:hyperlink w:anchor="ref-8">
         <w:r>
@@ -476,7 +485,18 @@
         </w:r>
       </w:hyperlink>
       <w:r>
-        <w:t xml:space="preserve">]. Đây là số mẫu sau xử lý của đề tài.</w:t>
+        <w:t xml:space="preserve">]; đây là số mẫu sau xử lý của đề tài và được giữ nguyên làm outer-test. Cấu hình huấn luyện chính có thể nới ngưỡng lên PSI(WT) ≤ 4,0, thêm 85 peptide (44.490 ô, 83 cụm cov80 mới) chỉ vào phần huấn luyện, tức 176 peptide huấn luyện [</w:t>
+      </w:r>
+      <w:hyperlink w:anchor="ref-11">
+        <w:r>
+          <w:rPr>
+            <w:rStyle w:val="Hyperlink"/>
+          </w:rPr>
+          <w:t xml:space="preserve">11</w:t>
+        </w:r>
+      </w:hyperlink>
+      <w:r>
+        <w:t xml:space="preserve">]. Cấu hình này chỉ được nhận vì đã đạt tiêu chí chốt trước (xem III.1); ngưỡng 3,0 vẫn được báo song song.</w:t>
       </w:r>
     </w:p>
     <w:p>
@@ -537,6 +557,29 @@
         <w:pStyle w:val="Compact"/>
       </w:pPr>
       <w:r>
+        <w:t xml:space="preserve">Koren 2018 (Table S4, saturation mutagenesis đầu C, cùng đại lượng PSI nhưng thư viện 23-mer và 3 bin) đã được audit: chỉ 5 cụm cov80 mới, thấp hơn ngưỡng 20 đã chốt, nên chỉ làm tập kiểm chứng ngoài cho lớp degron đầu C, không nhập vào huấn luyện. Nguồn không có giấy phép mở, chỉ dùng nội bộ [</w:t>
+      </w:r>
+      <w:hyperlink w:anchor="ref-15">
+        <w:r>
+          <w:rPr>
+            <w:rStyle w:val="Hyperlink"/>
+          </w:rPr>
+          <w:t xml:space="preserve">15</w:t>
+        </w:r>
+      </w:hyperlink>
+      <w:r>
+        <w:t xml:space="preserve">].</w:t>
+      </w:r>
+    </w:p>
+    <w:p>
+      <w:pPr>
+        <w:numPr>
+          <w:ilvl w:val="0"/>
+          <w:numId w:val="1002"/>
+        </w:numPr>
+        <w:pStyle w:val="Compact"/>
+      </w:pPr>
+      <w:r>
         <w:t xml:space="preserve">Không đặt nhận diện E3 cụ thể làm nhiệm vụ chính. Chưa thực hiện thí nghiệm sinh học mới; kết quả phần mềm hỗ trợ hình thành giả thuyết, không suy ra quan hệ nhân quả gây bệnh hoặc hiệu quả điều trị.</w:t>
       </w:r>
     </w:p>
@@ -1081,7 +1124,7 @@
         <w:pStyle w:val="BodyText"/>
       </w:pPr>
       <w:r>
-        <w:t xml:space="preserve">Trước hết, khảo sát đường cong học theo số cụm huấn luyện để kiểm tra giả thuyết thiếu nhãn. Sau đó, so cùng một bộ mã hóa ở hai chế độ khởi tạo ngẫu nhiên và tiền huấn luyện, dùng chung fold, ngân sách nhãn đột biến và quy trình chọn siêu tham số. Các nhánh mô hình là phương án dự kiến, được giữ lại theo bằng chứng; đề cương không mặc định một kiến trúc mới sẽ thắng đối chứng.</w:t>
+        <w:t xml:space="preserve">Trước hết, khảo sát đường cong học theo số cụm huấn luyện để kiểm tra giả thuyết thiếu nhãn (đã thực hiện, kết quả bên dưới). Sau đó, so cùng một bộ mã hóa ở hai chế độ khởi tạo ngẫu nhiên và tiền huấn luyện, dùng chung fold, ngân sách nhãn đột biến và quy trình chọn siêu tham số (đã thực hiện một thiết kế, kết quả âm). Các nhánh mô hình còn lại là phương án dự kiến, được giữ lại theo bằng chứng; đề cương không mặc định một kiến trúc mới sẽ thắng đối chứng.</w:t>
       </w:r>
     </w:p>
     <w:p>
@@ -1127,7 +1170,330 @@
         <w:pStyle w:val="BodyText"/>
       </w:pPr>
       <w:r>
-        <w:t xml:space="preserve">Đối với ứng viên mới, chỉ xem là có bằng chứng cải thiện khi chênh lệch ghép cặp với đối chứng chính có khoảng tin cậy dương và kết quả nhất quán qua các seed theo tiêu chí chốt trước. Nếu chưa đạt, báo cáo kết quả âm, giới hạn và nguyên mẫu sử dụng mô hình đối chứng tốt nhất; không tự coi mục tiêu đóng góp phương pháp đã hoàn thành.</w:t>
+        <w:t xml:space="preserve">Các khảo sát ngày 22/10/2026 bổ sung năm kết quả, tất cả trên benchmark phát triển theo cụm (OOF), không phải kiểm chứng ngoài độc lập; nguồn số liệu ở mục [</w:t>
+      </w:r>
+      <w:hyperlink w:anchor="ref-11">
+        <w:r>
+          <w:rPr>
+            <w:rStyle w:val="Hyperlink"/>
+          </w:rPr>
+          <w:t xml:space="preserve">11</w:t>
+        </w:r>
+      </w:hyperlink>
+      <w:r>
+        <w:t xml:space="preserve">–</w:t>
+      </w:r>
+      <w:hyperlink w:anchor="ref-15">
+        <w:r>
+          <w:rPr>
+            <w:rStyle w:val="Hyperlink"/>
+          </w:rPr>
+          <w:t xml:space="preserve">15</w:t>
+        </w:r>
+      </w:hyperlink>
+      <w:r>
+        <w:t xml:space="preserve">]:</w:t>
+      </w:r>
+    </w:p>
+    <w:p>
+      <w:pPr>
+        <w:numPr>
+          <w:ilvl w:val="0"/>
+          <w:numId w:val="1007"/>
+        </w:numPr>
+        <w:pStyle w:val="Compact"/>
+      </w:pPr>
+      <w:r>
+        <w:rPr>
+          <w:bCs/>
+          <w:b/>
+        </w:rPr>
+        <w:t xml:space="preserve">Đường cong học.</w:t>
+      </w:r>
+      <w:r>
+        <w:t xml:space="preserve"> </w:t>
+      </w:r>
+      <w:r>
+        <w:t xml:space="preserve">Với ridge, AUROC theo 25/50/75/100% số cụm huấn luyện là 0,7776 / 0,8044 / 0,8088 / 0,8082; chênh lệch 100% − 50% là +0,0038 với khoảng tin cậy 95% theo cụm [−0,0009; +0,0087], tức chưa đủ bằng chứng cho giả thuyết thiếu nhãn. Với mạng</w:t>
+      </w:r>
+      <w:r>
+        <w:t xml:space="preserve"> </w:t>
+      </w:r>
+      <w:r>
+        <w:rPr>
+          <w:rStyle w:val="VerbatimChar"/>
+        </w:rPr>
+        <w:t xml:space="preserve">gate_no_pap</w:t>
+      </w:r>
+      <w:r>
+        <w:t xml:space="preserve">, chênh lệch tương ứng là +0,0156 [+0,0060; +0,0256] và đường cong vẫn đi lên. Khoảng cách ridge − mạng thu hẹp nhưng chưa đảo chiều, nên kết quả này không phục hồi ứng viên kiến trúc nào đã bị loại [</w:t>
+      </w:r>
+      <w:hyperlink w:anchor="ref-11">
+        <w:r>
+          <w:rPr>
+            <w:rStyle w:val="Hyperlink"/>
+          </w:rPr>
+          <w:t xml:space="preserve">11</w:t>
+        </w:r>
+      </w:hyperlink>
+      <w:r>
+        <w:t xml:space="preserve">].</w:t>
+      </w:r>
+    </w:p>
+    <w:p>
+      <w:pPr>
+        <w:numPr>
+          <w:ilvl w:val="0"/>
+          <w:numId w:val="1007"/>
+        </w:numPr>
+        <w:pStyle w:val="Compact"/>
+      </w:pPr>
+      <w:r>
+        <w:rPr>
+          <w:bCs/>
+          <w:b/>
+        </w:rPr>
+        <w:t xml:space="preserve">Nới ngưỡng degron.</w:t>
+      </w:r>
+      <w:r>
+        <w:t xml:space="preserve"> </w:t>
+      </w:r>
+      <w:r>
+        <w:t xml:space="preserve">Thêm 85 peptide có PSI(WT) trong khoảng 3,0–4,0 vào phần huấn luyện, giữ nguyên outer-test, đưa AUROC của ridge từ 0,8082 lên 0,8208 (+0,0126; khoảng tin cậy [+0,0061; +0,0190]; dương ở cả ba seed). Kết luận còn đứng vững khi đổi</w:t>
+      </w:r>
+      <w:r>
+        <w:t xml:space="preserve"> </w:t>
+      </w:r>
+      <w:r>
+        <w:rPr>
+          <w:rStyle w:val="VerbatimChar"/>
+        </w:rPr>
+        <w:t xml:space="preserve">RESCUE_DELTA</w:t>
+      </w:r>
+      <w:r>
+        <w:t xml:space="preserve"> </w:t>
+      </w:r>
+      <w:r>
+        <w:t xml:space="preserve">(0,5 và 1,5), khi chia lại fold, và khi đổi sang ba phân hoạch protein thật sự khác (theo accession, id 0,2/cov 0,5, id 0,1/cov 0,3: +0,0166, +0,0134, +0,0113, khoảng tin cậy đều trên 0) [</w:t>
+      </w:r>
+      <w:hyperlink w:anchor="ref-11">
+        <w:r>
+          <w:rPr>
+            <w:rStyle w:val="Hyperlink"/>
+          </w:rPr>
+          <w:t xml:space="preserve">11</w:t>
+        </w:r>
+      </w:hyperlink>
+      <w:r>
+        <w:t xml:space="preserve">,</w:t>
+      </w:r>
+      <w:r>
+        <w:t xml:space="preserve"> </w:t>
+      </w:r>
+      <w:hyperlink w:anchor="ref-13">
+        <w:r>
+          <w:rPr>
+            <w:rStyle w:val="Hyperlink"/>
+          </w:rPr>
+          <w:t xml:space="preserve">13</w:t>
+        </w:r>
+      </w:hyperlink>
+      <w:r>
+        <w:t xml:space="preserve">]. Lợi ích đạt đỉnh quanh ngưỡng 4,0 rồi giảm ở các ngưỡng cao hơn; ngưỡng 4,0 được chốt trước khi thấy lưới này.</w:t>
+      </w:r>
+    </w:p>
+    <w:p>
+      <w:pPr>
+        <w:numPr>
+          <w:ilvl w:val="0"/>
+          <w:numId w:val="1007"/>
+        </w:numPr>
+        <w:pStyle w:val="Compact"/>
+      </w:pPr>
+      <w:r>
+        <w:rPr>
+          <w:bCs/>
+          <w:b/>
+        </w:rPr>
+        <w:t xml:space="preserve">Diễn giải thận trọng.</w:t>
+      </w:r>
+      <w:r>
+        <w:t xml:space="preserve"> </w:t>
+      </w:r>
+      <w:r>
+        <w:t xml:space="preserve">Phần tách riêng (thêm một nửa số cụm mới so với mốc cụm vùng cũ) ủng hộ cách đọc</w:t>
+      </w:r>
+      <w:r>
+        <w:t xml:space="preserve"> </w:t>
+      </w:r>
+      <w:r>
+        <w:t xml:space="preserve">“</w:t>
+      </w:r>
+      <w:r>
+        <w:t xml:space="preserve">độ phủ phân bố</w:t>
+      </w:r>
+      <w:r>
+        <w:t xml:space="preserve">”</w:t>
+      </w:r>
+      <w:r>
+        <w:t xml:space="preserve"> </w:t>
+      </w:r>
+      <w:r>
+        <w:t xml:space="preserve">ở ridge nhưng không dứt khoát ở mạng, và tiêu chí hình dạng chốt trước không đạt; kết luận là chưa phân định, không được viết thành</w:t>
+      </w:r>
+      <w:r>
+        <w:t xml:space="preserve"> </w:t>
+      </w:r>
+      <w:r>
+        <w:t xml:space="preserve">“</w:t>
+      </w:r>
+      <w:r>
+        <w:t xml:space="preserve">lợi ích hoàn toàn do mở rộng phân bố</w:t>
+      </w:r>
+      <w:r>
+        <w:t xml:space="preserve">”</w:t>
+      </w:r>
+      <w:r>
+        <w:t xml:space="preserve">. Chưa tách được</w:t>
+      </w:r>
+      <w:r>
+        <w:t xml:space="preserve"> </w:t>
+      </w:r>
+      <w:r>
+        <w:t xml:space="preserve">“</w:t>
+      </w:r>
+      <w:r>
+        <w:t xml:space="preserve">vùng PSI(WT) khác</w:t>
+      </w:r>
+      <w:r>
+        <w:t xml:space="preserve">”</w:t>
+      </w:r>
+      <w:r>
+        <w:t xml:space="preserve"> </w:t>
+      </w:r>
+      <w:r>
+        <w:t xml:space="preserve">khỏi</w:t>
+      </w:r>
+      <w:r>
+        <w:t xml:space="preserve"> </w:t>
+      </w:r>
+      <w:r>
+        <w:t xml:space="preserve">“</w:t>
+      </w:r>
+      <w:r>
+        <w:t xml:space="preserve">protein khác</w:t>
+      </w:r>
+      <w:r>
+        <w:t xml:space="preserve">”</w:t>
+      </w:r>
+      <w:r>
+        <w:t xml:space="preserve"> </w:t>
+      </w:r>
+      <w:r>
+        <w:t xml:space="preserve">[</w:t>
+      </w:r>
+      <w:hyperlink w:anchor="ref-11">
+        <w:r>
+          <w:rPr>
+            <w:rStyle w:val="Hyperlink"/>
+          </w:rPr>
+          <w:t xml:space="preserve">11</w:t>
+        </w:r>
+      </w:hyperlink>
+      <w:r>
+        <w:t xml:space="preserve">].</w:t>
+      </w:r>
+    </w:p>
+    <w:p>
+      <w:pPr>
+        <w:numPr>
+          <w:ilvl w:val="0"/>
+          <w:numId w:val="1007"/>
+        </w:numPr>
+        <w:pStyle w:val="Compact"/>
+      </w:pPr>
+      <w:r>
+        <w:rPr>
+          <w:bCs/>
+          <w:b/>
+        </w:rPr>
+        <w:t xml:space="preserve">Tiền huấn luyện nhãn mức tile (Voutsinos).</w:t>
+      </w:r>
+      <w:r>
+        <w:t xml:space="preserve"> </w:t>
+      </w:r>
+      <w:r>
+        <w:t xml:space="preserve">Tiền huấn luyện encoder trên 212.616 tile rồi tinh chỉnh ΔPSI cho AUROC 0,8098, thấp hơn khởi tạo ngẫu nhiên (0,8175; hiệu −0,0077, khoảng tin cậy [−0,0163; +0,0006]) và thấp hơn ridge (0,8208; hiệu −0,0110, khoảng tin cậy [−0,0197; −0,0024]). Kết quả âm này chỉ bác thiết kế</w:t>
+      </w:r>
+      <w:r>
+        <w:t xml:space="preserve"> </w:t>
+      </w:r>
+      <w:r>
+        <w:t xml:space="preserve">“</w:t>
+      </w:r>
+      <w:r>
+        <w:t xml:space="preserve">tiền huấn luyện trên nhãn mức peptide rồi tinh chỉnh toàn bộ</w:t>
+      </w:r>
+      <w:r>
+        <w:t xml:space="preserve">”</w:t>
+      </w:r>
+      <w:r>
+        <w:t xml:space="preserve"> </w:t>
+      </w:r>
+      <w:r>
+        <w:t xml:space="preserve">đã thử, không suy ra cho thiết kế khác [</w:t>
+      </w:r>
+      <w:hyperlink w:anchor="ref-12">
+        <w:r>
+          <w:rPr>
+            <w:rStyle w:val="Hyperlink"/>
+          </w:rPr>
+          <w:t xml:space="preserve">12</w:t>
+        </w:r>
+      </w:hyperlink>
+      <w:r>
+        <w:t xml:space="preserve">].</w:t>
+      </w:r>
+    </w:p>
+    <w:p>
+      <w:pPr>
+        <w:numPr>
+          <w:ilvl w:val="0"/>
+          <w:numId w:val="1007"/>
+        </w:numPr>
+        <w:pStyle w:val="Compact"/>
+      </w:pPr>
+      <w:r>
+        <w:rPr>
+          <w:bCs/>
+          <w:b/>
+        </w:rPr>
+        <w:t xml:space="preserve">Hiệu chuẩn.</w:t>
+      </w:r>
+      <w:r>
+        <w:t xml:space="preserve"> </w:t>
+      </w:r>
+      <w:r>
+        <w:t xml:space="preserve">Điểm thô của ridge kém hơn việc dùng tần suất nền (Brier 0,1272 so với 0,1139). Hiệu chuẩn Platt trong inner-train đưa Brier xuống 0,0925 (hiệu +0,0346; khoảng tin cậy [+0,0266; +0,0425]; dương ở cả ba seed), và top 10% phép thay thế mỗi peptide làm giàu ô dương 4,02 lần so với ngẫu nhiên. Xác suất sau hiệu chuẩn vẫn thiên thấp trên miền gốc (trung bình 0,115 so với 0,131 quan sát) [</w:t>
+      </w:r>
+      <w:hyperlink w:anchor="ref-14">
+        <w:r>
+          <w:rPr>
+            <w:rStyle w:val="Hyperlink"/>
+          </w:rPr>
+          <w:t xml:space="preserve">14</w:t>
+        </w:r>
+      </w:hyperlink>
+      <w:r>
+        <w:t xml:space="preserve">].</w:t>
+      </w:r>
+    </w:p>
+    <w:p>
+      <w:pPr>
+        <w:pStyle w:val="FirstParagraph"/>
+      </w:pPr>
+      <w:r>
+        <w:t xml:space="preserve">Đối với ứng viên mới, chỉ xem là có bằng chứng cải thiện khi chênh lệch ghép cặp với đối chứng chính có khoảng tin cậy dương và kết quả nhất quán qua các seed theo tiêu chí chốt trước. Nếu chưa đạt, báo cáo kết quả âm, giới hạn và nguyên mẫu sử dụng mô hình đối chứng tốt nhất; không tự coi mục tiêu đóng góp phương pháp đã hoàn thành. Hiện nguyên mẫu dùng ridge với cấu hình huấn luyện nới ngưỡng 4,0 cùng hiệu chuẩn Platt; chưa có ứng viên kiến trúc hay tiền huấn luyện nào đạt tiêu chí này. Trạng thái G2 (lợi ích ổn định của thành phần kiến trúc, đối chứng Degformer sạch cụm) và G3 (công cụ) vẫn chưa hoàn tất.</w:t>
       </w:r>
     </w:p>
     <w:bookmarkEnd w:id="29"/>
@@ -1389,12 +1755,117 @@
         <w:pStyle w:val="BodyText"/>
       </w:pPr>
       <w:r>
+        <w:rPr>
+          <w:bCs/>
+          <w:b/>
+        </w:rPr>
+        <w:t xml:space="preserve">Tiến độ đến 22/10/2026.</w:t>
+      </w:r>
+      <w:r>
+        <w:t xml:space="preserve"> </w:t>
+      </w:r>
+      <w:r>
+        <w:t xml:space="preserve">Bước 1–2 đã có phần lớn. Ở bước 3 đã đo đường cong học, nới ngưỡng degron, tiền huấn luyện nhãn tile (kết quả âm), hiệu chuẩn và nguyên mẫu dòng lệnh (chưa có API hay giao diện web) [</w:t>
+      </w:r>
+      <w:hyperlink w:anchor="ref-11">
+        <w:r>
+          <w:rPr>
+            <w:rStyle w:val="Hyperlink"/>
+          </w:rPr>
+          <w:t xml:space="preserve">11</w:t>
+        </w:r>
+      </w:hyperlink>
+      <w:r>
+        <w:t xml:space="preserve">–</w:t>
+      </w:r>
+      <w:hyperlink w:anchor="ref-14">
+        <w:r>
+          <w:rPr>
+            <w:rStyle w:val="Hyperlink"/>
+          </w:rPr>
+          <w:t xml:space="preserve">14</w:t>
+        </w:r>
+      </w:hyperlink>
+      <w:r>
+        <w:t xml:space="preserve">]; audit Koren 2018 chưa qua cổng nhập huấn luyện [</w:t>
+      </w:r>
+      <w:hyperlink w:anchor="ref-15">
+        <w:r>
+          <w:rPr>
+            <w:rStyle w:val="Hyperlink"/>
+          </w:rPr>
+          <w:t xml:space="preserve">15</w:t>
+        </w:r>
+      </w:hyperlink>
+      <w:r>
+        <w:t xml:space="preserve">]. Bước 4–5 gần như chưa làm; Chương 4 luận văn mới viết phần thực nghiệm đã có.</w:t>
+      </w:r>
+    </w:p>
+    <w:p>
+      <w:pPr>
+        <w:pStyle w:val="BodyText"/>
+      </w:pPr>
+      <w:r>
+        <w:rPr>
+          <w:bCs/>
+          <w:b/>
+        </w:rPr>
+        <w:t xml:space="preserve">Việc còn lại.</w:t>
+      </w:r>
+      <w:r>
+        <w:t xml:space="preserve"> </w:t>
+      </w:r>
+      <w:r>
+        <w:t xml:space="preserve">(a) Tìm thêm nguồn nhãn khác Koren: Timms 2023 và tiền ấn phẩm về biến thể gây bệnh phá degron (cả hai chưa xác minh quyền sử dụng, có đột biến điểm hay không và endpoint); (b) tách</w:t>
+      </w:r>
+      <w:r>
+        <w:t xml:space="preserve"> </w:t>
+      </w:r>
+      <w:r>
+        <w:t xml:space="preserve">“</w:t>
+      </w:r>
+      <w:r>
+        <w:t xml:space="preserve">vùng PSI(WT)</w:t>
+      </w:r>
+      <w:r>
+        <w:t xml:space="preserve">”</w:t>
+      </w:r>
+      <w:r>
+        <w:t xml:space="preserve"> </w:t>
+      </w:r>
+      <w:r>
+        <w:t xml:space="preserve">khỏi</w:t>
+      </w:r>
+      <w:r>
+        <w:t xml:space="preserve"> </w:t>
+      </w:r>
+      <w:r>
+        <w:t xml:space="preserve">“</w:t>
+      </w:r>
+      <w:r>
+        <w:t xml:space="preserve">protein khác</w:t>
+      </w:r>
+      <w:r>
+        <w:t xml:space="preserve">”</w:t>
+      </w:r>
+      <w:r>
+        <w:t xml:space="preserve"> </w:t>
+      </w:r>
+      <w:r>
+        <w:t xml:space="preserve">nếu có cặp peptide cùng protein ở hai vùng ngưỡng; (c) đối chứng Degformer sạch cụm để hoàn tất G2; (d) API và giao diện web cho nguyên mẫu, cùng bộ ca kiểm thử; (e) viết luận văn.</w:t>
+      </w:r>
+    </w:p>
+    <w:p>
+      <w:pPr>
+        <w:pStyle w:val="BodyText"/>
+      </w:pPr>
+      <w:r>
         <w:t xml:space="preserve">Tiến độ theo tuần và mốc nộp sẽ bổ sung sau khi có lịch học phần và thống nhất phạm vi với giảng viên hướng dẫn.</w:t>
       </w:r>
     </w:p>
     <w:bookmarkEnd w:id="30"/>
     <w:bookmarkEnd w:id="31"/>
-    <w:bookmarkStart w:id="41" w:name="iv.-ứng-dụng-thực-tế-và-nguồn-dữ-liệu"/>
+    <w:bookmarkStart w:id="42" w:name="iv.-ứng-dụng-thực-tế-và-nguồn-dữ-liệu"/>
     <w:p>
       <w:pPr>
         <w:pStyle w:val="Heading1"/>
@@ -1416,7 +1887,7 @@
       <w:pPr>
         <w:numPr>
           <w:ilvl w:val="0"/>
-          <w:numId w:val="1007"/>
+          <w:numId w:val="1008"/>
         </w:numPr>
         <w:pStyle w:val="Compact"/>
       </w:pPr>
@@ -1428,7 +1899,7 @@
       <w:pPr>
         <w:numPr>
           <w:ilvl w:val="0"/>
-          <w:numId w:val="1007"/>
+          <w:numId w:val="1008"/>
         </w:numPr>
         <w:pStyle w:val="Compact"/>
       </w:pPr>
@@ -1440,7 +1911,7 @@
       <w:pPr>
         <w:numPr>
           <w:ilvl w:val="0"/>
-          <w:numId w:val="1007"/>
+          <w:numId w:val="1008"/>
         </w:numPr>
         <w:pStyle w:val="Compact"/>
       </w:pPr>
@@ -1457,7 +1928,7 @@
       </w:r>
     </w:p>
     <w:bookmarkEnd w:id="32"/>
-    <w:bookmarkStart w:id="40" w:name="nguồn-dữ-liệu-thử-nghiệm"/>
+    <w:bookmarkStart w:id="41" w:name="nguồn-dữ-liệu-thử-nghiệm"/>
     <w:p>
       <w:pPr>
         <w:pStyle w:val="Heading2"/>
@@ -1700,6 +2171,49 @@
               <w:jc w:val="left"/>
             </w:pPr>
             <w:r>
+              <w:t xml:space="preserve">Koren 2018 — Table S4</w:t>
+            </w:r>
+          </w:p>
+        </w:tc>
+        <w:tc>
+          <w:tcPr/>
+          <w:p>
+            <w:pPr>
+              <w:pStyle w:val="Compact"/>
+              <w:jc w:val="left"/>
+            </w:pPr>
+            <w:r>
+              <w:t xml:space="preserve">Saturation mutagenesis đầu C, cùng đại lượng PSI nhưng thư viện 23-mer, 3 bin; chỉ kiểm chứng ngoài cho lớp degron đầu C, không nhập huấn luyện; nguồn không có giấy phép mở, chỉ dùng nội bộ</w:t>
+            </w:r>
+          </w:p>
+        </w:tc>
+        <w:tc>
+          <w:tcPr/>
+          <w:p>
+            <w:pPr>
+              <w:pStyle w:val="Compact"/>
+              <w:jc w:val="left"/>
+            </w:pPr>
+            <w:hyperlink r:id="rId37">
+              <w:r>
+                <w:rPr>
+                  <w:rStyle w:val="Hyperlink"/>
+                </w:rPr>
+                <w:t xml:space="preserve">DOI</w:t>
+              </w:r>
+            </w:hyperlink>
+          </w:p>
+        </w:tc>
+      </w:tr>
+      <w:tr>
+        <w:tc>
+          <w:tcPr/>
+          <w:p>
+            <w:pPr>
+              <w:pStyle w:val="Compact"/>
+              <w:jc w:val="left"/>
+            </w:pPr>
+            <w:r>
               <w:t xml:space="preserve">UniProtKB/Swiss-Prot</w:t>
             </w:r>
           </w:p>
@@ -1723,7 +2237,7 @@
               <w:pStyle w:val="Compact"/>
               <w:jc w:val="left"/>
             </w:pPr>
-            <w:hyperlink r:id="rId37">
+            <w:hyperlink r:id="rId38">
               <w:r>
                 <w:rPr>
                   <w:rStyle w:val="Hyperlink"/>
@@ -1766,7 +2280,7 @@
               <w:pStyle w:val="Compact"/>
               <w:jc w:val="left"/>
             </w:pPr>
-            <w:hyperlink r:id="rId38">
+            <w:hyperlink r:id="rId39">
               <w:r>
                 <w:rPr>
                   <w:rStyle w:val="Hyperlink"/>
@@ -1780,7 +2294,7 @@
             <w:r>
               <w:t xml:space="preserve"> </w:t>
             </w:r>
-            <w:hyperlink r:id="rId39">
+            <w:hyperlink r:id="rId40">
               <w:r>
                 <w:rPr>
                   <w:rStyle w:val="Hyperlink"/>
@@ -1811,9 +2325,9 @@
         <w:t xml:space="preserve">].</w:t>
       </w:r>
     </w:p>
-    <w:bookmarkEnd w:id="40"/>
     <w:bookmarkEnd w:id="41"/>
-    <w:bookmarkStart w:id="46" w:name="v.-các-dự-án-liên-quan"/>
+    <w:bookmarkEnd w:id="42"/>
+    <w:bookmarkStart w:id="47" w:name="v.-các-dự-án-liên-quan"/>
     <w:p>
       <w:pPr>
         <w:pStyle w:val="Heading1"/>
@@ -1950,7 +2464,7 @@
               <w:pStyle w:val="Compact"/>
               <w:jc w:val="left"/>
             </w:pPr>
-            <w:hyperlink r:id="rId42">
+            <w:hyperlink r:id="rId43">
               <w:r>
                 <w:rPr>
                   <w:rStyle w:val="Hyperlink"/>
@@ -1993,7 +2507,7 @@
               <w:pStyle w:val="Compact"/>
               <w:jc w:val="left"/>
             </w:pPr>
-            <w:hyperlink r:id="rId43">
+            <w:hyperlink r:id="rId44">
               <w:r>
                 <w:rPr>
                   <w:rStyle w:val="Hyperlink"/>
@@ -2036,7 +2550,7 @@
               <w:pStyle w:val="Compact"/>
               <w:jc w:val="left"/>
             </w:pPr>
-            <w:hyperlink r:id="rId44">
+            <w:hyperlink r:id="rId45">
               <w:r>
                 <w:rPr>
                   <w:rStyle w:val="Hyperlink"/>
@@ -2079,7 +2593,7 @@
               <w:pStyle w:val="Compact"/>
               <w:jc w:val="left"/>
             </w:pPr>
-            <w:hyperlink r:id="rId45">
+            <w:hyperlink r:id="rId46">
               <w:r>
                 <w:rPr>
                   <w:rStyle w:val="Hyperlink"/>
@@ -2099,8 +2613,8 @@
         <w:t xml:space="preserve">Ma trận thay thế, xử lý theo lô hoặc giao diện web không được dùng riêng để khẳng định tính mới. Điểm khác biệt dự kiến nằm ở bằng chứng đánh giá theo cụm, kiểm soát nguồn nhãn và quy trình hỗ trợ ưu tiên đột biến có thể tái tính.</w:t>
       </w:r>
     </w:p>
-    <w:bookmarkEnd w:id="46"/>
-    <w:bookmarkStart w:id="47" w:name="vi.-dự-kiến-kết-quả-và-đóng-góp"/>
+    <w:bookmarkEnd w:id="47"/>
+    <w:bookmarkStart w:id="48" w:name="vi.-dự-kiến-kết-quả-và-đóng-góp"/>
     <w:p>
       <w:pPr>
         <w:pStyle w:val="Heading1"/>
@@ -2113,7 +2627,7 @@
       <w:pPr>
         <w:numPr>
           <w:ilvl w:val="0"/>
-          <w:numId w:val="1008"/>
+          <w:numId w:val="1009"/>
         </w:numPr>
         <w:pStyle w:val="Compact"/>
       </w:pPr>
@@ -2135,7 +2649,7 @@
       <w:pPr>
         <w:numPr>
           <w:ilvl w:val="0"/>
-          <w:numId w:val="1008"/>
+          <w:numId w:val="1009"/>
         </w:numPr>
         <w:pStyle w:val="Compact"/>
       </w:pPr>
@@ -2150,14 +2664,36 @@
         <w:t xml:space="preserve"> </w:t>
       </w:r>
       <w:r>
-        <w:t xml:space="preserve">bằng chứng về ảnh hưởng của lượng nhãn và hiệu quả học chuyển tiếp đối với dự đoán ΔPSI. Nếu có cải thiện ổn định, xác định thành phần tạo lợi ích bằng ablation; nếu chưa có, báo cáo trung thực phạm vi thất bại và giới hạn kết luận.</w:t>
+        <w:t xml:space="preserve">bằng chứng về ảnh hưởng của lượng và phân bố nhãn, và hiệu quả học chuyển tiếp, đối với dự đoán ΔPSI. Đã có: nới ngưỡng degron cải thiện ridge (+0,0126) và bền qua các độ nhạy đã kiểm; tiền huấn luyện nhãn tile theo thiết kế đã thử chưa có lợi ích [</w:t>
+      </w:r>
+      <w:hyperlink w:anchor="ref-11">
+        <w:r>
+          <w:rPr>
+            <w:rStyle w:val="Hyperlink"/>
+          </w:rPr>
+          <w:t xml:space="preserve">11</w:t>
+        </w:r>
+      </w:hyperlink>
+      <w:r>
+        <w:t xml:space="preserve">–</w:t>
+      </w:r>
+      <w:hyperlink w:anchor="ref-13">
+        <w:r>
+          <w:rPr>
+            <w:rStyle w:val="Hyperlink"/>
+          </w:rPr>
+          <w:t xml:space="preserve">13</w:t>
+        </w:r>
+      </w:hyperlink>
+      <w:r>
+        <w:t xml:space="preserve">]. Nếu một ứng viên sau này cải thiện ổn định, xác định thành phần tạo lợi ích bằng ablation; nếu chưa có, báo cáo trung thực phạm vi thất bại và giới hạn kết luận. Mọi con số là benchmark phát triển, chưa phải kiểm chứng độc lập.</w:t>
       </w:r>
     </w:p>
     <w:p>
       <w:pPr>
         <w:numPr>
           <w:ilvl w:val="0"/>
-          <w:numId w:val="1008"/>
+          <w:numId w:val="1009"/>
         </w:numPr>
         <w:pStyle w:val="Compact"/>
       </w:pPr>
@@ -2172,14 +2708,25 @@
         <w:t xml:space="preserve"> </w:t>
       </w:r>
       <w:r>
-        <w:t xml:space="preserve">nguyên mẫu nhập peptide, tạo ma trận dự đoán, xếp hạng phép thay thế, đối chiếu dữ liệu đo và xuất kết quả kèm phiên bản mô hình, nguồn dữ liệu, miền áp dụng.</w:t>
+        <w:t xml:space="preserve">nguyên mẫu nhập peptide, tạo ma trận dự đoán, xếp hạng phép thay thế, đối chiếu dữ liệu đo và xuất kết quả kèm phiên bản mô hình, nguồn dữ liệu, miền áp dụng. Đã có bản dòng lệnh tối giản, xuất điểm đã hiệu chuẩn Platt và tái tính khớp runner (chênh dưới 1e-9) [</w:t>
+      </w:r>
+      <w:hyperlink w:anchor="ref-14">
+        <w:r>
+          <w:rPr>
+            <w:rStyle w:val="Hyperlink"/>
+          </w:rPr>
+          <w:t xml:space="preserve">14</w:t>
+        </w:r>
+      </w:hyperlink>
+      <w:r>
+        <w:t xml:space="preserve">]; giao diện web, API và bộ ca kiểm thử còn lại.</w:t>
       </w:r>
     </w:p>
     <w:p>
       <w:pPr>
         <w:numPr>
           <w:ilvl w:val="0"/>
-          <w:numId w:val="1008"/>
+          <w:numId w:val="1009"/>
         </w:numPr>
         <w:pStyle w:val="Compact"/>
       </w:pPr>
@@ -2201,7 +2748,7 @@
       <w:pPr>
         <w:numPr>
           <w:ilvl w:val="0"/>
-          <w:numId w:val="1008"/>
+          <w:numId w:val="1009"/>
         </w:numPr>
         <w:pStyle w:val="Compact"/>
       </w:pPr>
@@ -2219,8 +2766,8 @@
         <w:t xml:space="preserve">tổng quan, thiết kế phương pháp, kết quả định lượng, phân tích sai số, giới hạn và hướng phát triển. Khả năng vượt đối chứng và tính mới kiến trúc là mục tiêu cần kiểm chứng, chưa phải kết quả đã đạt.</w:t>
       </w:r>
     </w:p>
-    <w:bookmarkEnd w:id="47"/>
-    <w:bookmarkStart w:id="63" w:name="vii.-tài-liệu-tham-khảo"/>
+    <w:bookmarkEnd w:id="48"/>
+    <w:bookmarkStart w:id="69" w:name="vii.-tài-liệu-tham-khảo"/>
     <w:p>
       <w:pPr>
         <w:pStyle w:val="Heading1"/>
@@ -2263,12 +2810,12 @@
       <w:r>
         <w:t xml:space="preserve">–</w:t>
       </w:r>
-      <w:hyperlink w:anchor="ref-10">
+      <w:hyperlink w:anchor="ref-15">
         <w:r>
           <w:rPr>
             <w:rStyle w:val="Hyperlink"/>
           </w:rPr>
-          <w:t xml:space="preserve">10</w:t>
+          <w:t xml:space="preserve">15</w:t>
         </w:r>
       </w:hyperlink>
       <w:r>
@@ -2279,12 +2826,12 @@
       <w:pPr>
         <w:numPr>
           <w:ilvl w:val="0"/>
-          <w:numId w:val="1009"/>
+          <w:numId w:val="1010"/>
         </w:numPr>
         <w:pStyle w:val="Compact"/>
       </w:pPr>
-      <w:bookmarkStart w:id="48" w:name="ref-1"/>
-      <w:bookmarkEnd w:id="48"/>
+      <w:bookmarkStart w:id="49" w:name="ref-1"/>
+      <w:bookmarkEnd w:id="49"/>
       <w:r>
         <w:t xml:space="preserve">Zhang, Z. và cộng sự (2023).</w:t>
       </w:r>
@@ -2304,7 +2851,7 @@
       <w:r>
         <w:t xml:space="preserve"> </w:t>
       </w:r>
-      <w:hyperlink r:id="rId49">
+      <w:hyperlink r:id="rId50">
         <w:r>
           <w:rPr>
             <w:rStyle w:val="Hyperlink"/>
@@ -2320,12 +2867,12 @@
       <w:pPr>
         <w:numPr>
           <w:ilvl w:val="0"/>
-          <w:numId w:val="1009"/>
+          <w:numId w:val="1010"/>
         </w:numPr>
         <w:pStyle w:val="Compact"/>
       </w:pPr>
-      <w:bookmarkStart w:id="50" w:name="ref-2"/>
-      <w:bookmarkEnd w:id="50"/>
+      <w:bookmarkStart w:id="51" w:name="ref-2"/>
+      <w:bookmarkEnd w:id="51"/>
       <w:r>
         <w:t xml:space="preserve">Voutsinos, V. và cộng sự (2026).</w:t>
       </w:r>
@@ -2345,7 +2892,7 @@
       <w:r>
         <w:t xml:space="preserve"> </w:t>
       </w:r>
-      <w:hyperlink r:id="rId51">
+      <w:hyperlink r:id="rId52">
         <w:r>
           <w:rPr>
             <w:rStyle w:val="Hyperlink"/>
@@ -2361,12 +2908,12 @@
       <w:pPr>
         <w:numPr>
           <w:ilvl w:val="0"/>
-          <w:numId w:val="1009"/>
+          <w:numId w:val="1010"/>
         </w:numPr>
         <w:pStyle w:val="Compact"/>
       </w:pPr>
-      <w:bookmarkStart w:id="52" w:name="ref-3"/>
-      <w:bookmarkEnd w:id="52"/>
+      <w:bookmarkStart w:id="53" w:name="ref-3"/>
+      <w:bookmarkEnd w:id="53"/>
       <w:r>
         <w:t xml:space="preserve">Alpine2048.</w:t>
       </w:r>
@@ -2386,7 +2933,7 @@
       <w:r>
         <w:t xml:space="preserve"> </w:t>
       </w:r>
-      <w:hyperlink r:id="rId53">
+      <w:hyperlink r:id="rId54">
         <w:r>
           <w:rPr>
             <w:rStyle w:val="Hyperlink"/>
@@ -2402,12 +2949,12 @@
       <w:pPr>
         <w:numPr>
           <w:ilvl w:val="0"/>
-          <w:numId w:val="1009"/>
+          <w:numId w:val="1010"/>
         </w:numPr>
         <w:pStyle w:val="Compact"/>
       </w:pPr>
-      <w:bookmarkStart w:id="54" w:name="ref-4"/>
-      <w:bookmarkEnd w:id="54"/>
+      <w:bookmarkStart w:id="55" w:name="ref-4"/>
+      <w:bookmarkEnd w:id="55"/>
       <w:r>
         <w:t xml:space="preserve">Larsen, F. B. và cộng sự (2025).</w:t>
       </w:r>
@@ -2427,7 +2974,7 @@
       <w:r>
         <w:t xml:space="preserve"> </w:t>
       </w:r>
-      <w:hyperlink r:id="rId55">
+      <w:hyperlink r:id="rId56">
         <w:r>
           <w:rPr>
             <w:rStyle w:val="Hyperlink"/>
@@ -2443,12 +2990,12 @@
       <w:pPr>
         <w:numPr>
           <w:ilvl w:val="0"/>
-          <w:numId w:val="1009"/>
+          <w:numId w:val="1010"/>
         </w:numPr>
         <w:pStyle w:val="Compact"/>
       </w:pPr>
-      <w:bookmarkStart w:id="56" w:name="ref-5"/>
-      <w:bookmarkEnd w:id="56"/>
+      <w:bookmarkStart w:id="57" w:name="ref-5"/>
+      <w:bookmarkEnd w:id="57"/>
       <w:r>
         <w:t xml:space="preserve">Zheng, M. và cộng sự (2024).</w:t>
       </w:r>
@@ -2468,7 +3015,7 @@
       <w:r>
         <w:t xml:space="preserve"> </w:t>
       </w:r>
-      <w:hyperlink r:id="rId43">
+      <w:hyperlink r:id="rId44">
         <w:r>
           <w:rPr>
             <w:rStyle w:val="Hyperlink"/>
@@ -2484,12 +3031,12 @@
       <w:pPr>
         <w:numPr>
           <w:ilvl w:val="0"/>
-          <w:numId w:val="1009"/>
+          <w:numId w:val="1010"/>
         </w:numPr>
         <w:pStyle w:val="Compact"/>
       </w:pPr>
-      <w:bookmarkStart w:id="57" w:name="ref-6"/>
-      <w:bookmarkEnd w:id="57"/>
+      <w:bookmarkStart w:id="58" w:name="ref-6"/>
+      <w:bookmarkEnd w:id="58"/>
       <w:r>
         <w:t xml:space="preserve">Zhang và cộng sự (2023). Bộ dữ liệu đi kèm nghiên cứu degron,</w:t>
       </w:r>
@@ -2509,7 +3056,7 @@
       <w:r>
         <w:t xml:space="preserve"> </w:t>
       </w:r>
-      <w:hyperlink r:id="rId58">
+      <w:hyperlink r:id="rId59">
         <w:r>
           <w:rPr>
             <w:rStyle w:val="Hyperlink"/>
@@ -2525,12 +3072,12 @@
       <w:pPr>
         <w:numPr>
           <w:ilvl w:val="0"/>
-          <w:numId w:val="1009"/>
+          <w:numId w:val="1010"/>
         </w:numPr>
         <w:pStyle w:val="Compact"/>
       </w:pPr>
-      <w:bookmarkStart w:id="59" w:name="ref-7"/>
-      <w:bookmarkEnd w:id="59"/>
+      <w:bookmarkStart w:id="60" w:name="ref-7"/>
+      <w:bookmarkEnd w:id="60"/>
       <w:r>
         <w:t xml:space="preserve">NCBI.</w:t>
       </w:r>
@@ -2566,12 +3113,12 @@
       <w:pPr>
         <w:numPr>
           <w:ilvl w:val="0"/>
-          <w:numId w:val="1009"/>
+          <w:numId w:val="1010"/>
         </w:numPr>
         <w:pStyle w:val="Compact"/>
       </w:pPr>
-      <w:bookmarkStart w:id="60" w:name="ref-8"/>
-      <w:bookmarkEnd w:id="60"/>
+      <w:bookmarkStart w:id="61" w:name="ref-8"/>
+      <w:bookmarkEnd w:id="61"/>
       <w:r>
         <w:t xml:space="preserve">Nguyễn Thanh Trọng (18/10/2026).</w:t>
       </w:r>
@@ -2617,12 +3164,12 @@
       <w:pPr>
         <w:numPr>
           <w:ilvl w:val="0"/>
-          <w:numId w:val="1009"/>
+          <w:numId w:val="1010"/>
         </w:numPr>
         <w:pStyle w:val="Compact"/>
       </w:pPr>
-      <w:bookmarkStart w:id="61" w:name="ref-9"/>
-      <w:bookmarkEnd w:id="61"/>
+      <w:bookmarkStart w:id="62" w:name="ref-9"/>
+      <w:bookmarkEnd w:id="62"/>
       <w:r>
         <w:t xml:space="preserve">Nguyễn Thanh Trọng (18/10/2026).</w:t>
       </w:r>
@@ -2656,12 +3203,12 @@
       <w:pPr>
         <w:numPr>
           <w:ilvl w:val="0"/>
-          <w:numId w:val="1009"/>
+          <w:numId w:val="1010"/>
         </w:numPr>
         <w:pStyle w:val="Compact"/>
       </w:pPr>
-      <w:bookmarkStart w:id="62" w:name="ref-10"/>
-      <w:bookmarkEnd w:id="62"/>
+      <w:bookmarkStart w:id="63" w:name="ref-10"/>
+      <w:bookmarkEnd w:id="63"/>
       <w:r>
         <w:t xml:space="preserve">Nguyễn Thanh Trọng (21/10/2026).</w:t>
       </w:r>
@@ -2691,7 +3238,240 @@
         <w:t xml:space="preserve">; phần đề xuất chưa phải quyết định thực hiện.</w:t>
       </w:r>
     </w:p>
-    <w:bookmarkEnd w:id="63"/>
+    <w:p>
+      <w:pPr>
+        <w:numPr>
+          <w:ilvl w:val="0"/>
+          <w:numId w:val="1010"/>
+        </w:numPr>
+        <w:pStyle w:val="Compact"/>
+      </w:pPr>
+      <w:bookmarkStart w:id="64" w:name="ref-11"/>
+      <w:bookmarkEnd w:id="64"/>
+      <w:r>
+        <w:t xml:space="preserve">Nguyễn Thanh Trọng (22/10/2026).</w:t>
+      </w:r>
+      <w:r>
+        <w:t xml:space="preserve"> </w:t>
+      </w:r>
+      <w:r>
+        <w:rPr>
+          <w:iCs/>
+          <w:i/>
+        </w:rPr>
+        <w:t xml:space="preserve">Đường cong học theo cụm (P1) và nới ngưỡng degron (P0)</w:t>
+      </w:r>
+      <w:r>
+        <w:t xml:space="preserve">. Báo cáo nội bộ; số liệu từ</w:t>
+      </w:r>
+      <w:r>
+        <w:t xml:space="preserve"> </w:t>
+      </w:r>
+      <w:r>
+        <w:rPr>
+          <w:rStyle w:val="VerbatimChar"/>
+        </w:rPr>
+        <w:t xml:space="preserve">research/learning-curve-2026-10-22/results.json</w:t>
+      </w:r>
+      <w:r>
+        <w:t xml:space="preserve">,</w:t>
+      </w:r>
+      <w:r>
+        <w:t xml:space="preserve"> </w:t>
+      </w:r>
+      <w:r>
+        <w:rPr>
+          <w:rStyle w:val="VerbatimChar"/>
+        </w:rPr>
+        <w:t xml:space="preserve">results-b.json</w:t>
+      </w:r>
+      <w:r>
+        <w:t xml:space="preserve">,</w:t>
+      </w:r>
+      <w:r>
+        <w:t xml:space="preserve"> </w:t>
+      </w:r>
+      <w:r>
+        <w:rPr>
+          <w:rStyle w:val="VerbatimChar"/>
+        </w:rPr>
+        <w:t xml:space="preserve">results-c.json</w:t>
+      </w:r>
+      <w:r>
+        <w:t xml:space="preserve">; benchmark phát triển OOF.</w:t>
+      </w:r>
+    </w:p>
+    <w:p>
+      <w:pPr>
+        <w:numPr>
+          <w:ilvl w:val="0"/>
+          <w:numId w:val="1010"/>
+        </w:numPr>
+        <w:pStyle w:val="Compact"/>
+      </w:pPr>
+      <w:bookmarkStart w:id="65" w:name="ref-12"/>
+      <w:bookmarkEnd w:id="65"/>
+      <w:r>
+        <w:t xml:space="preserve">Nguyễn Thanh Trọng (22/10/2026).</w:t>
+      </w:r>
+      <w:r>
+        <w:t xml:space="preserve"> </w:t>
+      </w:r>
+      <w:r>
+        <w:rPr>
+          <w:iCs/>
+          <w:i/>
+        </w:rPr>
+        <w:t xml:space="preserve">P3 — tiền huấn luyện nhãn mức tile rồi tinh chỉnh ΔPSI</w:t>
+      </w:r>
+      <w:r>
+        <w:t xml:space="preserve">. Báo cáo nội bộ tại</w:t>
+      </w:r>
+      <w:r>
+        <w:t xml:space="preserve"> </w:t>
+      </w:r>
+      <w:r>
+        <w:rPr>
+          <w:rStyle w:val="VerbatimChar"/>
+        </w:rPr>
+        <w:t xml:space="preserve">research/pretrain-p3-2026-10-22/</w:t>
+      </w:r>
+      <w:r>
+        <w:t xml:space="preserve">; kết quả âm.</w:t>
+      </w:r>
+    </w:p>
+    <w:p>
+      <w:pPr>
+        <w:numPr>
+          <w:ilvl w:val="0"/>
+          <w:numId w:val="1010"/>
+        </w:numPr>
+        <w:pStyle w:val="Compact"/>
+      </w:pPr>
+      <w:bookmarkStart w:id="66" w:name="ref-13"/>
+      <w:bookmarkEnd w:id="66"/>
+      <w:r>
+        <w:t xml:space="preserve">Nguyễn Thanh Trọng (22/10/2026).</w:t>
+      </w:r>
+      <w:r>
+        <w:t xml:space="preserve"> </w:t>
+      </w:r>
+      <w:r>
+        <w:rPr>
+          <w:iCs/>
+          <w:i/>
+        </w:rPr>
+        <w:t xml:space="preserve">Độ nhạy theo độ mịn phân cụm của lợi ích nới ngưỡng</w:t>
+      </w:r>
+      <w:r>
+        <w:t xml:space="preserve">. Báo cáo nội bộ tại</w:t>
+      </w:r>
+      <w:r>
+        <w:t xml:space="preserve"> </w:t>
+      </w:r>
+      <w:r>
+        <w:rPr>
+          <w:rStyle w:val="VerbatimChar"/>
+        </w:rPr>
+        <w:t xml:space="preserve">research/recluster-sensitivity-2026-10-22/</w:t>
+      </w:r>
+      <w:r>
+        <w:t xml:space="preserve">.</w:t>
+      </w:r>
+    </w:p>
+    <w:p>
+      <w:pPr>
+        <w:numPr>
+          <w:ilvl w:val="0"/>
+          <w:numId w:val="1010"/>
+        </w:numPr>
+        <w:pStyle w:val="Compact"/>
+      </w:pPr>
+      <w:bookmarkStart w:id="67" w:name="ref-14"/>
+      <w:bookmarkEnd w:id="67"/>
+      <w:r>
+        <w:t xml:space="preserve">Nguyễn Thanh Trọng (22/10/2026).</w:t>
+      </w:r>
+      <w:r>
+        <w:t xml:space="preserve"> </w:t>
+      </w:r>
+      <w:r>
+        <w:rPr>
+          <w:iCs/>
+          <w:i/>
+        </w:rPr>
+        <w:t xml:space="preserve">P6 — hiệu chuẩn điểm và nguyên mẫu dòng lệnh</w:t>
+      </w:r>
+      <w:r>
+        <w:t xml:space="preserve">. Báo cáo nội bộ tại</w:t>
+      </w:r>
+      <w:r>
+        <w:t xml:space="preserve"> </w:t>
+      </w:r>
+      <w:r>
+        <w:rPr>
+          <w:rStyle w:val="VerbatimChar"/>
+        </w:rPr>
+        <w:t xml:space="preserve">research/calibration-p6-2026-10-22/</w:t>
+      </w:r>
+      <w:r>
+        <w:t xml:space="preserve">.</w:t>
+      </w:r>
+    </w:p>
+    <w:p>
+      <w:pPr>
+        <w:numPr>
+          <w:ilvl w:val="0"/>
+          <w:numId w:val="1010"/>
+        </w:numPr>
+        <w:pStyle w:val="Compact"/>
+      </w:pPr>
+      <w:bookmarkStart w:id="68" w:name="ref-15"/>
+      <w:bookmarkEnd w:id="68"/>
+      <w:r>
+        <w:t xml:space="preserve">Nguyễn Thanh Trọng (22/10/2026).</w:t>
+      </w:r>
+      <w:r>
+        <w:t xml:space="preserve"> </w:t>
+      </w:r>
+      <w:r>
+        <w:rPr>
+          <w:iCs/>
+          <w:i/>
+        </w:rPr>
+        <w:t xml:space="preserve">Audit Koren 2018 Table S4 và cổng P2</w:t>
+      </w:r>
+      <w:r>
+        <w:t xml:space="preserve">. Báo cáo nội bộ tại</w:t>
+      </w:r>
+      <w:r>
+        <w:t xml:space="preserve"> </w:t>
+      </w:r>
+      <w:r>
+        <w:rPr>
+          <w:rStyle w:val="VerbatimChar"/>
+        </w:rPr>
+        <w:t xml:space="preserve">research/koren-s4-audit-2026-10-22/</w:t>
+      </w:r>
+      <w:r>
+        <w:t xml:space="preserve">; nguồn gốc: Koren, I. và cộng sự (2018), Cell 173(7), 1622–1635.e14, DOI:</w:t>
+      </w:r>
+      <w:r>
+        <w:t xml:space="preserve"> </w:t>
+      </w:r>
+      <w:hyperlink r:id="rId37">
+        <w:r>
+          <w:rPr>
+            <w:rStyle w:val="Hyperlink"/>
+          </w:rPr>
+          <w:t xml:space="preserve">https://doi.org/10.1016/j.cell.2018.04.028</w:t>
+        </w:r>
+      </w:hyperlink>
+      <w:r>
+        <w:t xml:space="preserve">.</w:t>
+      </w:r>
+    </w:p>
+    <w:bookmarkEnd w:id="69"/>
     <w:sectPr>
       <w:pgSz w:h="15840" w:w="12240"/>
       <w:pgMar w:bottom="1440" w:footer="720" w:gutter="0" w:header="720" w:left="1440" w:right="1440" w:top="1440"/>
@@ -4940,6 +5720,9 @@
     <w:abstractNumId w:val="991"/>
   </w:num>
   <w:num w:numId="1009">
+    <w:abstractNumId w:val="991"/>
+  </w:num>
+  <w:num w:numId="1010">
     <w:abstractNumId w:val="99411"/>
     <w:lvlOverride w:ilvl="0">
       <w:startOverride w:val="1"/>

</xml_diff>